<commit_message>
Real pictures in place of the symbol drawings (D108)
Twelve files drew a plate, a label, a body, maps, place settings and blank boxes out of slashes and bars. Each is now a picture: eleven line drawings made to print in black and white, in an images/ folder beside the markdown, carried into the web page, the Word file, the PDF, the student copy and the teacher only copy. The build learned to do that: a figure line in the markdown, the picture copied to the site, pandoc told where the pictures live, and the teacher only HTML carrying the picture inside itself.

Co-Authored-By: Claude Fable 5.1 <noreply@anthropic.com>
Claude-Session: https://claude.ai/code/session_01TaQLEJCtq2ruLJPqxdFc8k
</commit_message>
<xml_diff>
--- a/downloads/documents/05 Materials/Unit 06/Slides/Slides 06.11 - Table Setting and Food Sharing Across Cultures and the Methods Check.docx
+++ b/downloads/documents/05 Materials/Unit 06/Slides/Slides 06.11 - Table Setting and Food Sharing Across Cultures and the Methods Check.docx
@@ -194,43 +194,57 @@
     </w:p>
     <w:p>
       <w:pPr>
-        <w:pStyle w:val="SourceCode"/>
-      </w:pPr>
-      <w:r>
-        <w:rPr>
-          <w:rStyle w:val="VerbatimChar"/>
-        </w:rPr>
-        <w:t xml:space="preserve">                          ( CUP )</w:t>
-      </w:r>
-      <w:r>
-        <w:br/>
-      </w:r>
-      <w:r>
-        <w:br/>
-      </w:r>
-      <w:r>
-        <w:rPr>
-          <w:rStyle w:val="VerbatimChar"/>
-        </w:rPr>
-        <w:t xml:space="preserve">   [NAPKIN]  (FORK)   |  PLATE  |   (KNIFE) (SPOON)</w:t>
-      </w:r>
-      <w:r>
-        <w:br/>
-      </w:r>
-      <w:r>
-        <w:rPr>
-          <w:rStyle w:val="VerbatimChar"/>
-        </w:rPr>
-        <w:t xml:space="preserve">                      |         |</w:t>
-      </w:r>
-      <w:r>
-        <w:br/>
-      </w:r>
-      <w:r>
-        <w:rPr>
-          <w:rStyle w:val="VerbatimChar"/>
-        </w:rPr>
-        <w:t xml:space="preserve">                      +---------+</w:t>
+        <w:pStyle w:val="CaptionedFigure"/>
+      </w:pPr>
+      <w:r>
+        <w:drawing>
+          <wp:inline>
+            <wp:extent cx="5486400" cy="3207433"/>
+            <wp:effectExtent b="0" l="0" r="0" t="0"/>
+            <wp:docPr descr="The basic place setting" title="" id="1" name="Picture"/>
+            <a:graphic>
+              <a:graphicData uri="http://schemas.openxmlformats.org/drawingml/2006/picture">
+                <pic:pic>
+                  <pic:nvPicPr>
+                    <pic:cNvPr descr="images/h0611-basic-setting.png" id="0" name="Picture"/>
+                    <pic:cNvPicPr>
+                      <a:picLocks noChangeArrowheads="1" noChangeAspect="1"/>
+                    </pic:cNvPicPr>
+                  </pic:nvPicPr>
+                  <pic:blipFill>
+                    <a:blip r:embed="rId25"/>
+                    <a:stretch>
+                      <a:fillRect/>
+                    </a:stretch>
+                  </pic:blipFill>
+                  <pic:spPr bwMode="auto">
+                    <a:xfrm>
+                      <a:off x="0" y="0"/>
+                      <a:ext cx="5486400" cy="3207433"/>
+                    </a:xfrm>
+                    <a:prstGeom prst="rect">
+                      <a:avLst/>
+                    </a:prstGeom>
+                    <a:noFill/>
+                    <a:ln w="9525">
+                      <a:noFill/>
+                      <a:headEnd/>
+                      <a:tailEnd/>
+                    </a:ln>
+                  </pic:spPr>
+                </pic:pic>
+              </a:graphicData>
+            </a:graphic>
+          </wp:inline>
+        </w:drawing>
+      </w:r>
+    </w:p>
+    <w:p>
+      <w:pPr>
+        <w:pStyle w:val="ImageCaption"/>
+      </w:pPr>
+      <w:r>
+        <w:t xml:space="preserve">The basic place setting</w:t>
       </w:r>
     </w:p>
     <w:p>
@@ -300,39 +314,65 @@
       <w:pPr>
         <w:pStyle w:val="Heading2"/>
       </w:pPr>
-      <w:bookmarkStart w:id="25" w:name="Xb8b9d058af339186e64fecac81e7a2cd8b6ceb0"/>
+      <w:bookmarkStart w:id="26" w:name="Xb8b9d058af339186e64fecac81e7a2cd8b6ceb0"/>
       <w:r>
         <w:t xml:space="preserve">Slide 5: The formal setting and the outside-in rule</w:t>
       </w:r>
-      <w:bookmarkEnd w:id="25"/>
-    </w:p>
-    <w:p>
-      <w:pPr>
-        <w:pStyle w:val="SourceCode"/>
-      </w:pPr>
-      <w:r>
-        <w:rPr>
-          <w:rStyle w:val="VerbatimChar"/>
-        </w:rPr>
-        <w:t xml:space="preserve">                              (WATER)</w:t>
-      </w:r>
-      <w:r>
-        <w:br/>
-      </w:r>
-      <w:r>
-        <w:rPr>
-          <w:rStyle w:val="VerbatimChar"/>
-        </w:rPr>
-        <w:t xml:space="preserve">              (DESSERT SPOON)</w:t>
-      </w:r>
-      <w:r>
-        <w:br/>
-      </w:r>
-      <w:r>
-        <w:rPr>
-          <w:rStyle w:val="VerbatimChar"/>
-        </w:rPr>
-        <w:t xml:space="preserve">   [NAPKIN] (SALAD)(DINNER) |  PLATE  | (KNIFE)(TEASPOON)(SOUP SPOON)</w:t>
+      <w:bookmarkEnd w:id="26"/>
+    </w:p>
+    <w:p>
+      <w:pPr>
+        <w:pStyle w:val="CaptionedFigure"/>
+      </w:pPr>
+      <w:r>
+        <w:drawing>
+          <wp:inline>
+            <wp:extent cx="5486400" cy="3629464"/>
+            <wp:effectExtent b="0" l="0" r="0" t="0"/>
+            <wp:docPr descr="The formal place setting" title="" id="1" name="Picture"/>
+            <a:graphic>
+              <a:graphicData uri="http://schemas.openxmlformats.org/drawingml/2006/picture">
+                <pic:pic>
+                  <pic:nvPicPr>
+                    <pic:cNvPr descr="images/h0611-formal-setting.png" id="0" name="Picture"/>
+                    <pic:cNvPicPr>
+                      <a:picLocks noChangeArrowheads="1" noChangeAspect="1"/>
+                    </pic:cNvPicPr>
+                  </pic:nvPicPr>
+                  <pic:blipFill>
+                    <a:blip r:embed="rId27"/>
+                    <a:stretch>
+                      <a:fillRect/>
+                    </a:stretch>
+                  </pic:blipFill>
+                  <pic:spPr bwMode="auto">
+                    <a:xfrm>
+                      <a:off x="0" y="0"/>
+                      <a:ext cx="5486400" cy="3629464"/>
+                    </a:xfrm>
+                    <a:prstGeom prst="rect">
+                      <a:avLst/>
+                    </a:prstGeom>
+                    <a:noFill/>
+                    <a:ln w="9525">
+                      <a:noFill/>
+                      <a:headEnd/>
+                      <a:tailEnd/>
+                    </a:ln>
+                  </pic:spPr>
+                </pic:pic>
+              </a:graphicData>
+            </a:graphic>
+          </wp:inline>
+        </w:drawing>
+      </w:r>
+    </w:p>
+    <w:p>
+      <w:pPr>
+        <w:pStyle w:val="ImageCaption"/>
+      </w:pPr>
+      <w:r>
+        <w:t xml:space="preserve">The formal place setting</w:t>
       </w:r>
     </w:p>
     <w:p>
@@ -408,11 +448,11 @@
       <w:pPr>
         <w:pStyle w:val="Heading2"/>
       </w:pPr>
-      <w:bookmarkStart w:id="26" w:name="slide-6-station-1-the-shared-platter"/>
+      <w:bookmarkStart w:id="28" w:name="slide-6-station-1-the-shared-platter"/>
       <w:r>
         <w:t xml:space="preserve">Slide 6: Station 1, the shared platter</w:t>
       </w:r>
-      <w:bookmarkEnd w:id="26"/>
+      <w:bookmarkEnd w:id="28"/>
     </w:p>
     <w:p>
       <w:pPr>
@@ -472,11 +512,11 @@
       <w:pPr>
         <w:pStyle w:val="Heading2"/>
       </w:pPr>
-      <w:bookmarkStart w:id="27" w:name="slide-7-station-2-chopsticks"/>
+      <w:bookmarkStart w:id="29" w:name="slide-7-station-2-chopsticks"/>
       <w:r>
         <w:t xml:space="preserve">Slide 7: Station 2, chopsticks</w:t>
       </w:r>
-      <w:bookmarkEnd w:id="27"/>
+      <w:bookmarkEnd w:id="29"/>
     </w:p>
     <w:p>
       <w:pPr>
@@ -524,11 +564,11 @@
       <w:pPr>
         <w:pStyle w:val="Heading2"/>
       </w:pPr>
-      <w:bookmarkStart w:id="28" w:name="X503d08166fe8a6b44aba458a619188044e58bc1"/>
+      <w:bookmarkStart w:id="30" w:name="X503d08166fe8a6b44aba458a619188044e58bc1"/>
       <w:r>
         <w:t xml:space="preserve">Slide 8: The right hand (the bowl beside Station 3)</w:t>
       </w:r>
-      <w:bookmarkEnd w:id="28"/>
+      <w:bookmarkEnd w:id="30"/>
     </w:p>
     <w:p>
       <w:pPr>
@@ -576,11 +616,11 @@
       <w:pPr>
         <w:pStyle w:val="Heading2"/>
       </w:pPr>
-      <w:bookmarkStart w:id="29" w:name="slide-9-station-3-bento-or-tiffin"/>
+      <w:bookmarkStart w:id="31" w:name="slide-9-station-3-bento-or-tiffin"/>
       <w:r>
         <w:t xml:space="preserve">Slide 9: Station 3, bento or tiffin</w:t>
       </w:r>
-      <w:bookmarkEnd w:id="29"/>
+      <w:bookmarkEnd w:id="31"/>
     </w:p>
     <w:p>
       <w:pPr>
@@ -640,11 +680,11 @@
       <w:pPr>
         <w:pStyle w:val="Heading2"/>
       </w:pPr>
-      <w:bookmarkStart w:id="30" w:name="slide-10-what-all-four-have-in-common"/>
+      <w:bookmarkStart w:id="32" w:name="slide-10-what-all-four-have-in-common"/>
       <w:r>
         <w:t xml:space="preserve">Slide 10: What all four have in common</w:t>
       </w:r>
-      <w:bookmarkEnd w:id="30"/>
+      <w:bookmarkEnd w:id="32"/>
     </w:p>
     <w:p>
       <w:pPr>
@@ -710,11 +750,11 @@
       <w:pPr>
         <w:pStyle w:val="Heading2"/>
       </w:pPr>
-      <w:bookmarkStart w:id="31" w:name="slide-11-hosting-basics-across-all-four"/>
+      <w:bookmarkStart w:id="33" w:name="slide-11-hosting-basics-across-all-four"/>
       <w:r>
         <w:t xml:space="preserve">Slide 11: Hosting basics, across all four</w:t>
       </w:r>
-      <w:bookmarkEnd w:id="31"/>
+      <w:bookmarkEnd w:id="33"/>
     </w:p>
     <w:p>
       <w:pPr>
@@ -762,11 +802,11 @@
       <w:pPr>
         <w:pStyle w:val="Heading2"/>
       </w:pPr>
-      <w:bookmarkStart w:id="32" w:name="slide-12-write-our-agreement"/>
+      <w:bookmarkStart w:id="34" w:name="slide-12-write-our-agreement"/>
       <w:r>
         <w:t xml:space="preserve">Slide 12: Write our agreement</w:t>
       </w:r>
-      <w:bookmarkEnd w:id="32"/>
+      <w:bookmarkEnd w:id="34"/>
     </w:p>
     <w:p>
       <w:pPr>
@@ -865,11 +905,11 @@
       <w:pPr>
         <w:pStyle w:val="Heading2"/>
       </w:pPr>
-      <w:bookmarkStart w:id="33" w:name="slide-13-cooking-methods-check"/>
+      <w:bookmarkStart w:id="35" w:name="slide-13-cooking-methods-check"/>
       <w:r>
         <w:t xml:space="preserve">Slide 13: Cooking Methods Check</w:t>
       </w:r>
-      <w:bookmarkEnd w:id="33"/>
+      <w:bookmarkEnd w:id="35"/>
     </w:p>
     <w:p>
       <w:pPr>
@@ -928,7 +968,7 @@
     <w:sectPr>
       <w:headerReference w:type="default" r:id="rId9"/>
       <w:pgSz w:w="12240" w:h="15840"/>
-      <w:pgMar w:top="1440" w:bottom="1440" w:left="1440" w:right="1440" w:header="504"/>
+      <w:pgMar w:top="1152" w:bottom="1152" w:left="1152" w:right="1152" w:header="504"/>
     </w:sectPr>
   </w:body>
 </w:document>

</xml_diff>